<commit_message>
B3 v12 binaries: sync deferred-cosmetics re-render (Table 4 dash normalization + abstract scoping)
Re-syncs b3/paper with the corrected B3 v12 docx + pdf after the deferred
cosmetic pass: Table 4 not-measured markers normalized to em-dash (matching
Table 7); the abstract demand-concentration guardrail scoped to direct-burn
protocols. No numeric, finding, or figure change. DOCX MD5 87860b8..., PDF MD5
a6b5e42..., 49 pages.
</commit_message>
<xml_diff>
--- a/b3/paper/B3_GeoDePIN_Final_v12.docx
+++ b/b3/paper/B3_GeoDePIN_Final_v12.docx
@@ -56,7 +56,7 @@
     </w:p>
     <w:p>
       <w:r>
-        <w:t xml:space="preserve">This paper analyzes a class of DePIN protocols the paper terms GeoDePIN: networks whose value depends on where hardware is deployed, not merely that it exists. Location-dependence creates design pressures absent from compute-only DePIN alternatives, and the paper evaluates how protocols respond using on-chain evidence from 13 networks and a 34-month longitudinal case study of Helium. Helium became the first GeoDePIN protocol where paid usage fully offsets token emissions, with its Subsidy-to-Revenue ratio (S2R) rising from 0.013 under coverage-based rewards to 1.84 between May 2023 and February 2026. Data Credit burns now exceed HNT emissions by approximately 84%, producing net annual deflation of 3 to 4%. However, roughly five purchasers account for 90% of those burns: a demand concentration that aggregate fiscal metrics cannot detect. DIMO (S2R 4.24) subsequently crossed fiscal parity; GEODNET (0.219) and Hivemapper (0.183) occupy a growth-phase middle tier; the remaining protocols cluster near zero. Governance concentration across the thirteen-protocol GeoDePIN cross-section examined here (Herfindahl-Hirschman Index 0.034 to 0.593) materially exceeds the post-exclusion DeFi benchmarks from a companion cross-sectional study (0.005 to 0.065). Four outputs organize the findings: a classification distinguishing GeoDePIN from location-independent protocols with testable predictions, a design playbook mapping mechanisms to protocol maturity stages, a health dashboard with demand-concentration guardrails, and a subtraction test for mechanism necessity.</w:t>
+        <w:t xml:space="preserve">This paper analyzes a class of DePIN protocols the paper terms GeoDePIN: networks whose value depends on where hardware is deployed, not merely that it exists. Location-dependence creates design pressures absent from compute-only DePIN alternatives, and the paper evaluates how protocols respond using on-chain evidence from 13 networks and a 34-month longitudinal case study of Helium. Helium became the first GeoDePIN protocol where paid usage fully offsets token emissions, with its Subsidy-to-Revenue ratio (S2R) rising from 0.013 under coverage-based rewards to 1.84 between May 2023 and February 2026. Data Credit burns now exceed HNT emissions by approximately 84%, producing net annual deflation of 3 to 4%. However, roughly five purchasers account for 90% of those burns: a demand concentration that aggregate fiscal metrics cannot detect. DIMO (S2R 4.24) subsequently crossed fiscal parity; GEODNET (0.219) and Hivemapper (0.183) occupy a growth-phase middle tier; the remaining protocols cluster near zero. Governance concentration across the thirteen-protocol GeoDePIN cross-section examined here (Herfindahl-Hirschman Index 0.034 to 0.593) materially exceeds the post-exclusion DeFi benchmarks from a companion cross-sectional study (0.005 to 0.065). Four outputs organize the findings: a classification distinguishing GeoDePIN from location-independent protocols with testable predictions, a design playbook mapping mechanisms to protocol maturity stages, a health dashboard with a demand-concentration guardrail for direct-burn protocols, and a subtraction test for mechanism necessity.</w:t>
       </w:r>
     </w:p>
     <w:p>
@@ -5522,7 +5522,7 @@
                 <w:sz w:val="16"/>
                 <w:szCs w:val="16"/>
               </w:rPr>
-              <w:t>–</w:t>
+              <w:t>—</w:t>
             </w:r>
           </w:p>
         </w:tc>
@@ -5625,7 +5625,7 @@
                 <w:sz w:val="16"/>
                 <w:szCs w:val="16"/>
               </w:rPr>
-              <w:t>–</w:t>
+              <w:t>—</w:t>
             </w:r>
           </w:p>
         </w:tc>
@@ -5728,7 +5728,7 @@
                 <w:sz w:val="16"/>
                 <w:szCs w:val="16"/>
               </w:rPr>
-              <w:t>–</w:t>
+              <w:t>—</w:t>
             </w:r>
           </w:p>
         </w:tc>
@@ -6140,7 +6140,7 @@
                 <w:sz w:val="16"/>
                 <w:szCs w:val="16"/>
               </w:rPr>
-              <w:t>–</w:t>
+              <w:t>—</w:t>
             </w:r>
           </w:p>
         </w:tc>
@@ -6229,7 +6229,7 @@
                 <w:sz w:val="16"/>
                 <w:szCs w:val="16"/>
               </w:rPr>
-              <w:t>–</w:t>
+              <w:t>—</w:t>
             </w:r>
           </w:p>
         </w:tc>
@@ -6243,7 +6243,7 @@
                 <w:sz w:val="16"/>
                 <w:szCs w:val="16"/>
               </w:rPr>
-              <w:t>–</w:t>
+              <w:t>—</w:t>
             </w:r>
           </w:p>
         </w:tc>
@@ -6332,7 +6332,7 @@
                 <w:sz w:val="16"/>
                 <w:szCs w:val="16"/>
               </w:rPr>
-              <w:t>–</w:t>
+              <w:t>—</w:t>
             </w:r>
           </w:p>
         </w:tc>
@@ -6346,7 +6346,7 @@
                 <w:sz w:val="16"/>
                 <w:szCs w:val="16"/>
               </w:rPr>
-              <w:t>–</w:t>
+              <w:t>—</w:t>
             </w:r>
           </w:p>
         </w:tc>
@@ -6435,7 +6435,7 @@
                 <w:sz w:val="16"/>
                 <w:szCs w:val="16"/>
               </w:rPr>
-              <w:t>–</w:t>
+              <w:t>—</w:t>
             </w:r>
           </w:p>
         </w:tc>
@@ -6449,7 +6449,7 @@
                 <w:sz w:val="16"/>
                 <w:szCs w:val="16"/>
               </w:rPr>
-              <w:t>–</w:t>
+              <w:t>—</w:t>
             </w:r>
           </w:p>
         </w:tc>

</xml_diff>

<commit_message>
B3 v1.6.2: whole-paper correctness pass (Helium CSV reproducibility + headline corrections)
- data/raw/helium_s2r_cleaned.csv: Feb-2026 row corrected from the retired stale
  2.06 (777,042/377,260) to the canonical 1.84 (1,144,240/621,370), so the package
  reproduces manuscript Table 3. TTM basis is net inflationary (S2R ~0.49).
- b3/paper: synced corrected v12 docx + pdf (Helium lead finding now the first
  net-deflationary monthly readings, not full steady-state offset; DIMO 4.24 a
  single elevated month; governance comparison reframed to the B2 post-exclusion
  test p=0.028 d=0.65).

Detail: CHANGELOG 1.6.2; manuscript-side report in the workflow repo at
handoff/b3_whole_paper_audit_2026-06-08.md.
</commit_message>
<xml_diff>
--- a/b3/paper/B3_GeoDePIN_Final_v12.docx
+++ b/b3/paper/B3_GeoDePIN_Final_v12.docx
@@ -56,7 +56,7 @@
     </w:p>
     <w:p>
       <w:r>
-        <w:t xml:space="preserve">This paper analyzes a class of DePIN protocols the paper terms GeoDePIN: networks whose value depends on where hardware is deployed, not merely that it exists. Location-dependence creates design pressures absent from compute-only DePIN alternatives, and the paper evaluates how protocols respond using on-chain evidence from 13 networks and a 34-month longitudinal case study of Helium. Helium became the first GeoDePIN protocol where paid usage fully offsets token emissions, with its Subsidy-to-Revenue ratio (S2R) rising from 0.013 under coverage-based rewards to 1.84 between May 2023 and February 2026. Data Credit burns now exceed HNT emissions by approximately 84%, producing net annual deflation of 3 to 4%. However, roughly five purchasers account for 90% of those burns: a demand concentration that aggregate fiscal metrics cannot detect. DIMO (S2R 4.24) subsequently crossed fiscal parity; GEODNET (0.219) and Hivemapper (0.183) occupy a growth-phase middle tier; the remaining protocols cluster near zero. Governance concentration across the thirteen-protocol GeoDePIN cross-section examined here (Herfindahl-Hirschman Index 0.034 to 0.593) materially exceeds the post-exclusion DeFi benchmarks from a companion cross-sectional study (0.005 to 0.065). Four outputs organize the findings: a classification distinguishing GeoDePIN from location-independent protocols with testable predictions, a design playbook mapping mechanisms to protocol maturity stages, a health dashboard with a demand-concentration guardrail for direct-burn protocols, and a subtraction test for mechanism necessity.</w:t>
+        <w:t xml:space="preserve">This paper analyzes a class of DePIN protocols the paper terms GeoDePIN: networks whose value depends on where hardware is deployed, not merely that it exists. Location-dependence creates design pressures absent from compute-only DePIN alternatives, and the paper evaluates how protocols respond using on-chain evidence from 13 networks and a 34-month longitudinal case study of Helium. Helium reached the first net-deflationary monthly readings observed among GeoDePIN protocols, its Subsidy-to-Revenue ratio (S2R) rising from 0.013 under coverage-based rewards to a monthly peak of 1.84 between May 2023 and February 2026. In the strongest months Data Credit burns exceeded HNT emissions (peak monthly S2R 1.84), but on a trailing-twelve-month basis the network remained net inflationary (S2R approximately 0.49), and steady-state offset is lower still once temporary post-HIP-147 burn allocations and WiFi-offload pricing are normalized. However, roughly five purchasers account for 90% of those burns: a demand concentration that aggregate fiscal metrics cannot detect. DIMO posted a higher single-month reading (S2R 4.24) during a period of elevated developer-license purchases rather than at sustained equilibrium; GEODNET (0.219) and Hivemapper (0.183) occupy a growth-phase middle tier; the remaining protocols cluster near zero. Governance concentration is high across the GeoDePIN cross-section (pre-exclusion Herfindahl-Hirschman Index 0.034 to 0.593); a companion cross-sectional study confirms DePIN tokens are significantly more governance-concentrated than DeFi after excluding protocol-controlled addresses (Mann-Whitney p = 0.028, Cohen’s d = 0.65). Four outputs organize the findings: a classification distinguishing GeoDePIN from location-independent protocols with testable predictions, a design playbook mapping mechanisms to protocol maturity stages, a health dashboard with a demand-concentration guardrail for direct-burn protocols, and a subtraction test for mechanism necessity.</w:t>
       </w:r>
     </w:p>
     <w:p>
@@ -2137,7 +2137,7 @@
         <w:rPr>
           <w:b w:val="0"/>
         </w:rPr>
-        <w:t>We measure governance concentration using the Herfindahl-Hirschman Index (HHI) computed over the distribution of governance token holdings across unique addresses, using a snapshot methodology from Dune Analytics [8] multi-chain queries as of February 2026. The governance token is the protocol's primary voting-power token; for protocols with delegated voting, the analysis uses delegated voting power distribution. We compute Gini coefficients over the same distributions. Full metric definitions and replication procedures appear in Appendix A.</w:t>
+        <w:t>We measure governance concentration using the Herfindahl-Hirschman Index (HHI) computed over the distribution of governance token holdings across unique addresses, using a snapshot methodology from Dune Analytics [8] multi-chain queries as of February 2026. The governance token is the protocol's primary voting-power token; for protocols with delegated voting, the analysis uses delegated voting power distribution. We compute Gini coefficients over the same distributions. Full metric definitions and replication procedures appear in the public replication package (see Data Availability).</w:t>
       </w:r>
     </w:p>
     <w:p>
@@ -3910,9 +3910,9 @@
         <w:rPr>
           <w:b w:val="0"/>
         </w:rPr>
-        <w:t>Three fiscal regimes emerge across the 34-month S2R trajectory (Table 3): (1) post-migration baseline (S2R 0.01 to 0.04, May 2023 to early 2024), when burns were minimal and issuance dominated; (2) demand ramp (S2R 0.15 to 0.67, mid-2024), as Mobile subscriber growth and IoT data transfer increased burn volume; (3) fiscal parity and beyond (S2R 1.03 to 1.84 , late 2025 to February 2026), when monthly burns consistently exceeded issuance.</w:t>
+        <w:t>Three fiscal regimes emerge across the 34-month S2R trajectory (Table 3): (1) post-migration baseline (S2R 0.01 to 0.04, May 2023 to early 2024), when burns were minimal and issuance dominated; (2) demand ramp (S2R 0.15 to 0.67, mid-2025), as Mobile subscriber growth and IoT data transfer increased burn volume; (3) fiscal parity and beyond (S2R 1.03 to 1.84 , late 2025 to February 2026), when monthly burns consistently exceeded issuance.</w:t>
         <w:br/>
-        <w:t>Helium became the first GeoDePIN protocol where demand-side spending fully offsets supply-side inflation. DIMO subsequently achieved S2R = 4.24, making it the second protocol to demonstrate fiscal parity through demand-coupled burns. A pricing caveat applies to Helium's December 2025 peak: WiFi offload traffic is priced at $0.10-0.25 per GB versus $0.50 for CBRS, and the annualized burn figure reflects a temporary Mobile burn allocation subsequently adjusted, so the S2R spike overstates steady-state equilibrium by an estimated 2-5x.</w:t>
+        <w:t>Helium reached the first net-deflationary monthly readings observed among GeoDePIN protocols. DIMO posted a higher single-month reading (S2R = 4.24), but in a period of elevated developer-license purchases against low emissions rather than at sustained equilibrium, so it is not yet a confirmed second parity case. A steady-state caveat applies to the Helium headline: WiFi offload traffic is priced at $0.10-0.25 per GB versus $0.50 for CBRS, and the February 2026 reading reflects a temporary post-HIP-147 Mobile burn allocation since reduced, so the monthly peak overstates steady-state equilibrium by an estimated 2-5x. On a trailing-twelve-month basis (March 2025 to February 2026) the network remained net inflationary, with burns offsetting roughly half of issuance (S2R approximately 0.49).</w:t>
       </w:r>
     </w:p>
     <w:p>
@@ -5118,7 +5118,7 @@
     <w:p>
       <w:r>
         <w:rPr/>
-        <w:t>Hivemapper's sink architecture implements a burn-and-mint model (users burn tokens to purchase service credits; operators earn newly minted tokens for providing service) similar to Helium's DC system. Map Credits are purchased with HONEY (burned), and contributors earn HONEY for submitting verified imagery. MIP-7 introduced tiered pricing based on map freshness and coverage. Dune Analytics queries (February 2026) yield S2R = 0.183 (1.9M HONEY burned against 10.4M minted), confirming that the burn mechanism is active but that Hivemapper remains subsidy-dependent: burns offset less than one-fifth of issuance. The mechanism design is structurally similar to Helium's DC burn model, and the measurable S2R places Hivemapper in the growth-phase cohort between subsidy-dependent protocols (S2R near zero) and fiscally self-sustaining pairs (Helium at 1.84, DIMO at 4.24).</w:t>
+        <w:t>Hivemapper's sink architecture implements a burn-and-mint model (users burn tokens to purchase service credits; operators earn newly minted tokens for providing service) similar to Helium's DC system. Map Credits are purchased with HONEY (burned), and contributors earn HONEY for submitting verified imagery. MIP-7 introduced tiered pricing based on map freshness and coverage. Dune Analytics queries (February 2026) yield S2R = 0.183 (1.9M HONEY burned against 10.4M minted), confirming that the burn mechanism is active but that Hivemapper remains subsidy-dependent: burns offset less than one-fifth of issuance. The mechanism design is structurally similar to Helium's DC burn model, and the measurable S2R places Hivemapper in the growth-phase cohort between subsidy-dependent protocols (S2R near zero) and the protocols with recent monthly S2R above unity (Helium and DIMO).</w:t>
       </w:r>
     </w:p>
     <w:p>
@@ -5216,7 +5216,7 @@
     <w:p>
       <w:r>
         <w:rPr/>
-        <w:t>GEODNET operates a decentralized network of Real-Time Kinematic (RTK) base stations on Solana (primary, since GIP7) and Polygon (original chain). The unit of service is centimeter-level GNSS positioning corrections, consumed by drones, autonomous vehicles, agricultural equipment, and construction machinery. Enterprise clients (50+, including Quectel and DroneDeploy) purchase subscriptions whose revenue funds a buy-and-burn mechanism. As of March 2026, GEODNET has a market capitalization of $59M with 425 million circulating tokens out of 968 million total supply (CoinGecko [6]), a network of 20,000+ stations across 150+ countries, and annualized recurring revenue of $7.3M (December 2025).</w:t>
+        <w:t>GEODNET operates a decentralized network of Real-Time Kinematic (RTK) base stations on Solana (primary, since GIP7) and Polygon (original chain). The unit of service is centimeter-level GNSS positioning corrections, consumed by drones, autonomous vehicles, agricultural equipment, and construction machinery. A stated enterprise client base (50+, including Quectel and DroneDeploy; issuer-reported) purchases subscriptions whose revenue funds a buy-and-burn mechanism. As of March 2026, GEODNET has a market capitalization of $59M with 425 million circulating tokens out of 968 million total supply (CoinGecko [6]), a network of 20,000+ stations across 150+ countries, and annualized recurring revenue of $7.3M (December 2025).</w:t>
       </w:r>
     </w:p>
     <w:p>
@@ -5240,7 +5240,7 @@
     <w:p>
       <w:r>
         <w:rPr/>
-        <w:t xml:space="preserve">GEODNET’s sustainability signal is the strongest in the growth-phase tier. On-chain burn and net-issuance data indicate a single-peaked monthly absorption trajectory since the September 2024 Solana migration, with the February 2026 reading at 21.9% (S2R 0.219), exceeding Hivemapper (0.183) but remaining well below the fiscal-parity trajectory that Helium followed. By early 2026, the network spanned 5,802 cities with median station earnings of $47.63 per month [32]. Three structural factors support continued S2R improvement: (1) the 80% burn rate converts revenue directly to token removal; (2) annual halving reduces the issuance denominator; (3) ARR growth of 18% month-over-month (December 2025) increases the burn numerator. Unit economics show RTK positioning at $1–5/station/month versus Trimble/Hexagon incumbents at $50–100/station/month (Table 5), a 10–80x cost advantage with Medium subsidy risk. The enterprise client base (50+ organizations) and the non-discretionary nature of precision positioning for autonomous systems suggest demand resilience beyond speculative token use.</w:t>
+        <w:t xml:space="preserve">GEODNET’s sustainability signal is the strongest in the growth-phase tier. On-chain burn and net-issuance data indicate a single-peaked monthly absorption trajectory since the September 2024 Solana migration, with the February 2026 reading at 21.9% (S2R 0.219), exceeding Hivemapper (0.183) but remaining well below the fiscal-parity trajectory that Helium followed. By early 2026, the network spanned 5,802 cities with median station earnings of $47.63 per month [32]. Three structural factors support continued S2R improvement: (1) the 80% burn rate converts revenue directly to token removal; (2) annual halving reduces the issuance denominator; (3) ARR growth of 18% month-over-month (December 2025) increases the burn numerator. Unit economics show RTK positioning at $1–5/station/month versus Trimble/Hexagon incumbents at $50–100/station/month (Table 5), a 10–80x cost advantage with Medium subsidy risk. The stated enterprise client base (50+ organizations, issuer-reported) and the non-discretionary nature of precision positioning for autonomous systems suggest demand resilience beyond speculative token use.</w:t>
       </w:r>
     </w:p>
     <w:p>
@@ -6496,7 +6496,7 @@
         <w:rPr>
           <w:b w:val="0"/>
         </w:rPr>
-        <w:t xml:space="preserve">A three-tier sustainability hierarchy emerges from the comparative summary (Table 4). At the top, Helium (S2R 1.84) and DIMO (S2R 4.24) have crossed fiscal parity, with burns exceeding issuance. In a growth-phase middle tier, GEODNET (S2R 0.219) and Hivemapper (S2R 0.183) show confirmed on-chain burn activity but remain subsidy-dependent. The remaining protocols cluster near S2R zero, the default condition for DePIN. Two additional findings sharpen the picture. Governance data are missing for protocols not on chains with transparent voting records, meaning governance risk is unmeasured rather than absent. And the subsidy risk column reveals a bimodal distribution: protocols with established demand sinks face medium risk, while those without any burn mechanism face critical risk regardless of positioning narrative.</w:t>
+        <w:t xml:space="preserve">A three-tier sustainability hierarchy emerges from the comparative summary (Table 4). At the top, Helium reached net-deflationary monthly readings (peak S2R 1.84) and DIMO posted a single elevated month (S2R 4.24); both show burns exceeding issuance in recent months, though neither is yet confirmed at sustained equilibrium (Helium remained net inflationary on a trailing-twelve-month basis). In a growth-phase middle tier, GEODNET (S2R 0.219) and Hivemapper (S2R 0.183) show confirmed on-chain burn activity but remain subsidy-dependent. The remaining protocols cluster near S2R zero, the default condition for DePIN. Two additional findings sharpen the picture. Governance data are missing for protocols not on chains with transparent voting records, meaning governance risk is unmeasured rather than absent. And the subsidy risk column reveals a bimodal distribution: protocols with established demand sinks face medium risk, while those without any burn mechanism face critical risk regardless of positioning narrative.</w:t>
       </w:r>
       <w:r>
         <w:t xml:space="preserve"> A companion simulation [29] calibrated to Helium parameters shows that a comparable protocol does not approach S2R parity within 5 years under realistic demand assumptions (the burn-to-emission ratio peaks at 0.0061), consistent with Helium's 7+ year journey to fiscal sustainability. This suggests that the S2R crossing is a late-stage achievement and that protocols should design emission budgets for a multi-year subsidy-dependent phase rather than expecting rapid crossover.</w:t>
@@ -8151,7 +8151,7 @@
         <w:rPr>
           <w:b w:val="0"/>
         </w:rPr>
-        <w:t xml:space="preserve">The data reveal a sector where most protocols are simultaneously governance-concentrated and subsidy-dependent. Only four protocols show confirmed burn activity above zero: Helium (S2R 1.84), DIMO (4.24), GEODNET (0.219), and Hivemapper (0.183); Helium and DIMO have crossed fiscal parity (S2R ≥ 1.0), with GEODNET on a single-peaked absorption trajectory that ramped to a peak in late 2025 before easing (Table 7). The following implications derive from this paper’s own empirical evidence.</w:t>
+        <w:t xml:space="preserve">The data reveal a sector where most protocols are simultaneously governance-concentrated and subsidy-dependent. Only four protocols show confirmed burn activity above zero: Helium (S2R 1.84), DIMO (4.24), GEODNET (0.219), and Hivemapper (0.183); Helium and DIMO posted recent months with S2R ≥ 1.0 (Helium across late 2025 to February 2026, DIMO in a single elevated month), with GEODNET on a single-peaked absorption trajectory that ramped to a peak in late 2025 before easing (Table 7). The following implications derive from this paper’s own empirical evidence.</w:t>
       </w:r>
     </w:p>
     <w:p>
@@ -9264,7 +9264,7 @@
                 <w:sz w:val="16"/>
                 <w:szCs w:val="16"/>
               </w:rPr>
-              <w:t>Dune Analytics (Feb 2026); burn-and-mint active but not queryable via Dune</w:t>
+              <w:t>Dune Analytics (Feb 2026); burns route through a single credit-purchase relayer (off-axis for demand concentration)</w:t>
             </w:r>
           </w:p>
         </w:tc>
@@ -9993,7 +9993,7 @@
         <w:rPr>
           <w:b w:val="0"/>
         </w:rPr>
-        <w:t xml:space="preserve">The S2R data across 13 protocols reveal a three-tier sustainability hierarchy for DePIN: Helium (1.84) and DIMO (4.24) have crossed fiscal parity through demand-coupled burns; GEODNET (0.219) and Hivemapper (0.183) occupy a growth-phase middle tier with confirmed burn activity but continued subsidy dependence; and the remaining protocols cluster near S2R zero, the sector default. The Helium longitudinal case (Table 3) documents the trajectory: demand-coupled burns can drive S2R above fiscal parity when paired with service-based reward transitions (HIP-147), but demand concentration (top-5 signers at approximately 90% of burns) creates a shadow risk invisible to aggregate metrics. Governance concentration in GeoDePIN tokens (HHI 0.034 to 0.593) materially exceeds the post-exclusion DeFi benchmarks from a companion cross-sectional study (0.005 to 0.065), consistent with the 13-protocol cross-section. The four-loop design architecture (economic, operational, integrity, governance), grounded in institutional design principles, and the GeoDePIN vs. DeVIN taxonomy (Table 2) organize these findings into testable structure.</w:t>
+        <w:t xml:space="preserve">The S2R data across 13 protocols reveal a three-tier sustainability hierarchy for DePIN: Helium reached the first net-deflationary monthly readings (peak S2R 1.84) and DIMO a single elevated month (S2R 4.24), though on a trailing-twelve-month basis Helium remained net inflationary (S2R approximately 0.49); GEODNET (0.219) and Hivemapper (0.183) occupy a growth-phase middle tier with confirmed burn activity but continued subsidy dependence; and the remaining protocols cluster near S2R zero, the sector default. The Helium longitudinal case (Table 3) documents the trajectory: demand-coupled burns can drive S2R above fiscal parity when paired with service-based reward transitions (HIP-147), but demand concentration (top-5 signers at approximately 90% of burns) creates a shadow risk invisible to aggregate metrics. Governance concentration is high across the GeoDePIN cross-section (pre-exclusion HHI 0.034 to 0.593); the companion cross-sectional study confirms DePIN tokens are significantly more concentrated than DeFi after excluding protocol-controlled addresses (Mann-Whitney p = 0.028, Cohen’s d = 0.65). The four-loop design architecture (economic, operational, integrity, governance), grounded in institutional design principles, and the GeoDePIN vs. DeVIN taxonomy (Table 2) organize these findings into testable structure.</w:t>
       </w:r>
     </w:p>
     <w:p>
@@ -10025,7 +10025,7 @@
         <w:rPr>
           <w:b w:val="0"/>
         </w:rPr>
-        <w:t>The governance concentration cross-section is a February 2026 snapshot; concentration trajectories over time would strengthen causal claims. Unit economics use posted prices (N = 1 per service domain); we estimate subsidy decomposition. The Helium S2R trajectory is observational: HIP-147 was not randomized, and confounders cannot be fully separated. Several protocols remain data-insufficient; their metrics are unmeasured, not absent. The sample includes only protocols that have survived to 2026; failed or abandoned projects may exhibit different patterns. Design recommendations generalize from Helium (the primary longitudinal case) to other GeoDePIN protocols by analogy; direct replication across multiple protocols would strengthen external validity.</w:t>
+        <w:t>The governance concentration cross-section is a February 2026 snapshot; concentration trajectories over time would strengthen causal claims. Unit economics use posted prices (N = 1 per service domain); we estimate subsidy decomposition. The Helium S2R trajectory is observational: HIP-147 was not randomized, and confounders cannot be fully separated. Several protocols remain data-insufficient; their metrics are unmeasured, not absent. The sample includes only protocols that have survived to 2026; failed or abandoned projects may exhibit different patterns. Design recommendations generalize from Helium (the primary longitudinal case) to other GeoDePIN protocols by analogy; direct replication across multiple protocols would strengthen external validity. Three fiscal caveats further bound the headline findings: Helium’s monthly S2R peaked at 1.84 but the network remained net inflationary on a trailing-twelve-month basis (S2R approximately 0.49), and the peak reflects temporary post-HIP-147 burn allocations that overstate steady-state offset by an estimated 2-5x; DIMO’s S2R 4.24 is a single elevated-purchase month rather than a sustained equilibrium; and on-chain burn-signer concentration is a valid demand-concentration measure only for direct-burn protocols (Helium), so for buy-and-burn and pooled-burn architectures (GEODNET, DIMO, Hivemapper) the demand base is off-chain and not measured here.</w:t>
       </w:r>
     </w:p>
     <w:p>
@@ -10033,7 +10033,7 @@
         <w:rPr>
           <w:b w:val="0"/>
         </w:rPr>
-        <w:t xml:space="preserve">The S2R metric as currently specified measures burns against mining emissions; it does not capture vesting-driven dilution from team, investor, and ecosystem unlocks, which for GEODNET represented 54% of total supply by Q2 2025. A comprehensive fiscal sustainability metric would incorporate all supply sources; this extension is specified as a future research direction.</w:t>
+        <w:t xml:space="preserve">The S2R metric as currently specified measures burns against mining emissions; it does not capture vesting-driven dilution from team, investor, and ecosystem unlocks, a supply source distinct from the mining emissions in the denominator. A comprehensive fiscal sustainability metric would incorporate all supply sources; this extension is specified as a future research direction.</w:t>
       </w:r>
     </w:p>
     <w:p>

</xml_diff>